<commit_message>
Add all suit card classes
Introduce new suit card types (Hook, Kraken, Map, Mermaid, Oracle, Sword) with header and source files.
</commit_message>
<xml_diff>
--- a/System_Design_Documentation.docx
+++ b/System_Design_Documentation.docx
@@ -5,7 +5,12 @@
     <w:sdt>
       <w:sdtPr>
         <w:rPr>
+          <w:rFonts w:eastAsiaTheme="minorHAnsi"/>
+          <w:kern w:val="2"/>
           <w:sz w:val="2"/>
+          <w:szCs w:val="24"/>
+          <w:lang w:val="en-AU"/>
+          <w14:ligatures w14:val="standardContextual"/>
         </w:rPr>
         <w:id w:val="-2119368921"/>
         <w:docPartObj>
@@ -15,11 +20,7 @@
       </w:sdtPr>
       <w:sdtEndPr>
         <w:rPr>
-          <w:rFonts w:eastAsiaTheme="minorHAnsi"/>
-          <w:kern w:val="2"/>
           <w:sz w:val="24"/>
-          <w:szCs w:val="24"/>
-          <w14:ligatures w14:val="standardContextual"/>
         </w:rPr>
       </w:sdtEndPr>
       <w:sdtContent>

</xml_diff>